<commit_message>
status: SOS roster + deployment
</commit_message>
<xml_diff>
--- a/deliverables/Civvix_12-STATEWIDE-BUILD-STATUS.docx
+++ b/deliverables/Civvix_12-STATEWIDE-BUILD-STATUS.docx
@@ -2,13 +2,13 @@
 <file path=word/document.xml><?xml version="1.0" encoding="utf-8"?>
 <w:document xmlns:w="http://schemas.openxmlformats.org/wordprocessingml/2006/main" xmlns:m="http://schemas.openxmlformats.org/officeDocument/2006/math" xmlns:r="http://schemas.openxmlformats.org/officeDocument/2006/relationships" xmlns:o="urn:schemas-microsoft-com:office:office" xmlns:v="urn:schemas-microsoft-com:vml" xmlns:w10="urn:schemas-microsoft-com:office:word" xmlns:a="http://schemas.openxmlformats.org/drawingml/2006/main" xmlns:pic="http://schemas.openxmlformats.org/drawingml/2006/picture" xmlns:wp="http://schemas.openxmlformats.org/drawingml/2006/wordprocessingDrawing">
   <w:body>
-    <w:bookmarkStart w:id="26" w:name="statewide-build-status-as-of-13-sep-2026"/>
+    <w:bookmarkStart w:id="28" w:name="Xb5ce0343ae22f581b50716c7066753e520e96fd"/>
     <w:p>
       <w:pPr>
         <w:pStyle w:val="Heading1"/>
       </w:pPr>
       <w:r>
-        <w:t xml:space="preserve">Statewide build — status as of 13 Sep 2026</w:t>
+        <w:t xml:space="preserve">Statewide build — status as of 13 Sep 2026 (updated: SOS roster + deploy)</w:t>
       </w:r>
     </w:p>
     <w:p>
@@ -395,7 +395,7 @@
               <w:jc w:val="left"/>
             </w:pPr>
             <w:r>
-              <w:t xml:space="preserve">323,007 across 76 counties</w:t>
+              <w:t xml:space="preserve">359,077 across all 95 counties</w:t>
             </w:r>
           </w:p>
         </w:tc>
@@ -447,7 +447,7 @@
               <w:jc w:val="left"/>
             </w:pPr>
             <w:r>
-              <w:t xml:space="preserve">1,089</w:t>
+              <w:t xml:space="preserve">5,786</w:t>
             </w:r>
           </w:p>
         </w:tc>
@@ -473,7 +473,7 @@
               <w:jc w:val="left"/>
             </w:pPr>
             <w:r>
-              <w:t xml:space="preserve">9,691</w:t>
+              <w:t xml:space="preserve">11,222</w:t>
             </w:r>
           </w:p>
         </w:tc>
@@ -499,7 +499,7 @@
               <w:jc w:val="left"/>
             </w:pPr>
             <w:r>
-              <w:t xml:space="preserve">49,305</w:t>
+              <w:t xml:space="preserve">61,170</w:t>
             </w:r>
           </w:p>
         </w:tc>
@@ -525,7 +525,7 @@
               <w:jc w:val="left"/>
             </w:pPr>
             <w:r>
-              <w:t xml:space="preserve">55,092 rooftops</w:t>
+              <w:t xml:space="preserve">58,550 rooftops</w:t>
             </w:r>
           </w:p>
         </w:tc>
@@ -562,13 +562,13 @@
         <w:pStyle w:val="BodyText"/>
       </w:pPr>
       <w:r>
-        <w:t xml:space="preserve">Top counties by business universe: Davidson 58,067 · Knox 39,862 · Rutherford 39,802 · Shelby 39,598 ·</w:t>
-      </w:r>
-      <w:r>
-        <w:t xml:space="preserve"> </w:t>
-      </w:r>
-      <w:r>
-        <w:t xml:space="preserve">Williamson 25,919 · Hamilton 21,201 · Sumner 14,974 · Wilson 13,006.</w:t>
+        <w:t xml:space="preserve">Top counties by business universe: Davidson 58,950 · Rutherford 39,862 · Shelby 39,443 · Knox 39,209 ·</w:t>
+      </w:r>
+      <w:r>
+        <w:t xml:space="preserve"> </w:t>
+      </w:r>
+      <w:r>
+        <w:t xml:space="preserve">Williamson 27,253 · Hamilton 21,152 · Sumner 14,899 · Wilson 13,306.</w:t>
       </w:r>
     </w:p>
     <w:p>
@@ -576,7 +576,7 @@
         <w:pStyle w:val="BodyText"/>
       </w:pPr>
       <w:r>
-        <w:t xml:space="preserve">Highest cross-county-postal counts: Shelby 232, Wilson 136, Rutherford 75, Hamilton 51, Davidson 28.</w:t>
+        <w:t xml:space="preserve">Highest cross-county-postal counts: Davidson 1,310, Wilson 521, Shelby 257, Rutherford 208, Hamilton 97.</w:t>
       </w:r>
     </w:p>
     <w:bookmarkEnd w:id="21"/>
@@ -762,7 +762,7 @@
         <w:pStyle w:val="Compact"/>
       </w:pPr>
       <w:r>
-        <w:t xml:space="preserve">Atlas marks the 19 counties with no Secretary of State entity file as</w:t>
+        <w:t xml:space="preserve">Atlas marks any county without a Secretary of State entity file as</w:t>
       </w:r>
       <w:r>
         <w:t xml:space="preserve"> </w:t>
@@ -780,17 +780,101 @@
         <w:t xml:space="preserve"> </w:t>
       </w:r>
       <w:r>
-        <w:t xml:space="preserve">rather than 0.</w:t>
+        <w:t xml:space="preserve">(none today).</w:t>
       </w:r>
     </w:p>
     <w:bookmarkEnd w:id="22"/>
-    <w:bookmarkStart w:id="23" w:name="known-gaps"/>
+    <w:bookmarkStart w:id="23" w:name="sos-roster-added-13-sep-second-pass"/>
     <w:p>
       <w:pPr>
         <w:pStyle w:val="Heading2"/>
       </w:pPr>
       <w:r>
-        <w:t xml:space="preserve">Known gaps</w:t>
+        <w:t xml:space="preserve">SOS roster (added 13 Sep, second pass)</w:t>
+      </w:r>
+    </w:p>
+    <w:p>
+      <w:pPr>
+        <w:pStyle w:val="FirstParagraph"/>
+      </w:pPr>
+      <w:r>
+        <w:t xml:space="preserve">The business layer for all 95 counties now comes from the Secretary of State statewide RECORDS</w:t>
+      </w:r>
+      <w:r>
+        <w:t xml:space="preserve"> </w:t>
+      </w:r>
+      <w:r>
+        <w:t xml:space="preserve">extract (26 Aug 2026 master) with the Oct 2025 – Aug 2026 monthly increments applied, deduplicated</w:t>
+      </w:r>
+      <w:r>
+        <w:t xml:space="preserve"> </w:t>
+      </w:r>
+      <w:r>
+        <w:t xml:space="preserve">by ControlNumber (latest wins): 1,421,894 entities, 1,183,429 with a Tennessee principal-address</w:t>
+      </w:r>
+      <w:r>
+        <w:t xml:space="preserve"> </w:t>
+      </w:r>
+      <w:r>
+        <w:t xml:space="preserve">county, 388,375 active for-profit, 324,393 (83.5%) geocoded to an NG911 rooftop. County assignment</w:t>
+      </w:r>
+      <w:r>
+        <w:t xml:space="preserve"> </w:t>
+      </w:r>
+      <w:r>
+        <w:t xml:space="preserve">is the filer’s own PrincipalAddressCounty, which is why cross-county postal rose from 1,089 to 5,786:</w:t>
+      </w:r>
+      <w:r>
+        <w:t xml:space="preserve"> </w:t>
+      </w:r>
+      <w:r>
+        <w:t xml:space="preserve">an entity that tells the State it sits in Wilson County while its address says Old Hickory is exactly</w:t>
+      </w:r>
+      <w:r>
+        <w:t xml:space="preserve"> </w:t>
+      </w:r>
+      <w:r>
+        <w:t xml:space="preserve">the population the audit is for (Wilson 136 → 521, Davidson 28 → 1,310).</w:t>
+      </w:r>
+      <w:r>
+        <w:t xml:space="preserve"> </w:t>
+      </w:r>
+      <w:r>
+        <w:rPr>
+          <w:rStyle w:val="VerbatimChar"/>
+        </w:rPr>
+        <w:t xml:space="preserve">fetch/sos_refresh.py</w:t>
+      </w:r>
+      <w:r>
+        <w:t xml:space="preserve"> </w:t>
+      </w:r>
+      <w:r>
+        <w:t xml:space="preserve">applies each new monthly increment;</w:t>
+      </w:r>
+      <w:r>
+        <w:t xml:space="preserve"> </w:t>
+      </w:r>
+      <w:r>
+        <w:rPr>
+          <w:rStyle w:val="VerbatimChar"/>
+        </w:rPr>
+        <w:t xml:space="preserve">deploy/DEPLOY.md</w:t>
+      </w:r>
+      <w:r>
+        <w:t xml:space="preserve"> </w:t>
+      </w:r>
+      <w:r>
+        <w:t xml:space="preserve">§5 has the routine.</w:t>
+      </w:r>
+    </w:p>
+    <w:bookmarkEnd w:id="23"/>
+    <w:bookmarkStart w:id="24" w:name="deployment-prepared-awaiting-dans-push"/>
+    <w:p>
+      <w:pPr>
+        <w:pStyle w:val="Heading2"/>
+      </w:pPr>
+      <w:r>
+        <w:t xml:space="preserve">Deployment (prepared, awaiting Dan’s push)</w:t>
       </w:r>
     </w:p>
     <w:p>
@@ -802,62 +886,70 @@
         <w:pStyle w:val="Compact"/>
       </w:pPr>
       <w:r>
-        <w:rPr>
-          <w:bCs/>
-          <w:b/>
-        </w:rPr>
-        <w:t xml:space="preserve">19 counties have no SOS entity file yet</w:t>
-      </w:r>
-      <w:r>
-        <w:t xml:space="preserve"> </w:t>
-      </w:r>
-      <w:r>
-        <w:t xml:space="preserve">(business layer empty; rooftop analysis is complete):</w:t>
-      </w:r>
-      <w:r>
-        <w:t xml:space="preserve"> </w:t>
-      </w:r>
-      <w:r>
-        <w:t xml:space="preserve">Blount, Chester, Cocke, Decatur, Fentress, Greene, Hardeman, Hickman, Humphreys, Johnson, Loudon,</w:t>
-      </w:r>
-      <w:r>
-        <w:t xml:space="preserve"> </w:t>
-      </w:r>
-      <w:r>
-        <w:t xml:space="preserve">McNairy, Meigs, Monroe, Rhea, Robertson, Tipton, Van Buren, Washington. Pull the TN SOS county</w:t>
-      </w:r>
-      <w:r>
-        <w:t xml:space="preserve"> </w:t>
-      </w:r>
-      <w:r>
-        <w:t xml:space="preserve">entity TSVs for these and drop them in</w:t>
-      </w:r>
-      <w:r>
-        <w:t xml:space="preserve"> </w:t>
-      </w:r>
-      <w:r>
-        <w:rPr>
-          <w:rStyle w:val="VerbatimChar"/>
-        </w:rPr>
-        <w:t xml:space="preserve">data/sos/</w:t>
-      </w:r>
-      <w:r>
-        <w:t xml:space="preserve">;</w:t>
-      </w:r>
-      <w:r>
-        <w:t xml:space="preserve"> </w:t>
-      </w:r>
-      <w:r>
-        <w:rPr>
-          <w:rStyle w:val="VerbatimChar"/>
-        </w:rPr>
-        <w:t xml:space="preserve">fetch/make_configs.py</w:t>
-      </w:r>
-      <w:r>
-        <w:t xml:space="preserve"> </w:t>
-      </w:r>
-      <w:r>
-        <w:t xml:space="preserve">wires them.</w:t>
+        <w:t xml:space="preserve">Repo</w:t>
+      </w:r>
+      <w:r>
+        <w:t xml:space="preserve"> </w:t>
+      </w:r>
+      <w:r>
+        <w:rPr>
+          <w:rStyle w:val="VerbatimChar"/>
+        </w:rPr>
+        <w:t xml:space="preserve">~/Downloads/tn-situs-atlas</w:t>
+      </w:r>
+      <w:r>
+        <w:t xml:space="preserve"> </w:t>
+      </w:r>
+      <w:r>
+        <w:t xml:space="preserve">on Dan’s Mac (two commits on</w:t>
+      </w:r>
+      <w:r>
+        <w:t xml:space="preserve"> </w:t>
+      </w:r>
+      <w:r>
+        <w:rPr>
+          <w:rStyle w:val="VerbatimChar"/>
+        </w:rPr>
+        <w:t xml:space="preserve">main</w:t>
+      </w:r>
+      <w:r>
+        <w:t xml:space="preserve">, clean).</w:t>
+      </w:r>
+      <w:r>
+        <w:t xml:space="preserve"> </w:t>
+      </w:r>
+      <w:r>
+        <w:rPr>
+          <w:rStyle w:val="VerbatimChar"/>
+        </w:rPr>
+        <w:t xml:space="preserve">site/</w:t>
+      </w:r>
+      <w:r>
+        <w:t xml:space="preserve"> </w:t>
+      </w:r>
+      <w:r>
+        <w:t xml:space="preserve">holds the</w:t>
+      </w:r>
+      <w:r>
+        <w:t xml:space="preserve"> </w:t>
+      </w:r>
+      <w:r>
+        <w:t xml:space="preserve">atlas + all 95 workbenches as a plain static site (172 MB);</w:t>
+      </w:r>
+      <w:r>
+        <w:t xml:space="preserve"> </w:t>
+      </w:r>
+      <w:r>
+        <w:rPr>
+          <w:rStyle w:val="VerbatimChar"/>
+        </w:rPr>
+        <w:t xml:space="preserve">site/CNAME</w:t>
+      </w:r>
+      <w:r>
+        <w:t xml:space="preserve"> </w:t>
+      </w:r>
+      <w:r>
+        <w:t xml:space="preserve">= navigationholdings.com.</w:t>
       </w:r>
     </w:p>
     <w:p>
@@ -869,13 +961,124 @@
         <w:pStyle w:val="Compact"/>
       </w:pPr>
       <w:r>
-        <w:t xml:space="preserve">Low DOR address-range match rates worth a look before selling those counties: Obion 26%,</w:t>
-      </w:r>
-      <w:r>
-        <w:t xml:space="preserve"> </w:t>
-      </w:r>
-      <w:r>
-        <w:t xml:space="preserve">Unicoi 27%, Cocke 36%, McMinn 41%, Marion 51%. Probably street-name conventions in the 911 layer.</w:t>
+        <w:rPr>
+          <w:rStyle w:val="VerbatimChar"/>
+        </w:rPr>
+        <w:t xml:space="preserve">.github/workflows/pages.yml</w:t>
+      </w:r>
+      <w:r>
+        <w:t xml:space="preserve"> </w:t>
+      </w:r>
+      <w:r>
+        <w:t xml:space="preserve">deploys</w:t>
+      </w:r>
+      <w:r>
+        <w:t xml:space="preserve"> </w:t>
+      </w:r>
+      <w:r>
+        <w:rPr>
+          <w:rStyle w:val="VerbatimChar"/>
+        </w:rPr>
+        <w:t xml:space="preserve">site/</w:t>
+      </w:r>
+      <w:r>
+        <w:t xml:space="preserve"> </w:t>
+      </w:r>
+      <w:r>
+        <w:t xml:space="preserve">to GitHub Pages on push;</w:t>
+      </w:r>
+      <w:r>
+        <w:t xml:space="preserve"> </w:t>
+      </w:r>
+      <w:r>
+        <w:rPr>
+          <w:rStyle w:val="VerbatimChar"/>
+        </w:rPr>
+        <w:t xml:space="preserve">refresh.yml</w:t>
+      </w:r>
+      <w:r>
+        <w:t xml:space="preserve"> </w:t>
+      </w:r>
+      <w:r>
+        <w:t xml:space="preserve">re-pulls and</w:t>
+      </w:r>
+      <w:r>
+        <w:t xml:space="preserve"> </w:t>
+      </w:r>
+      <w:r>
+        <w:t xml:space="preserve">re-runs all 95 counties weekly and commits</w:t>
+      </w:r>
+      <w:r>
+        <w:t xml:space="preserve"> </w:t>
+      </w:r>
+      <w:r>
+        <w:rPr>
+          <w:rStyle w:val="VerbatimChar"/>
+        </w:rPr>
+        <w:t xml:space="preserve">site/</w:t>
+      </w:r>
+      <w:r>
+        <w:t xml:space="preserve">.</w:t>
+      </w:r>
+      <w:r>
+        <w:t xml:space="preserve"> </w:t>
+      </w:r>
+      <w:r>
+        <w:rPr>
+          <w:rStyle w:val="VerbatimChar"/>
+        </w:rPr>
+        <w:t xml:space="preserve">deploy/Dockerfile.site</w:t>
+      </w:r>
+      <w:r>
+        <w:t xml:space="preserve"> </w:t>
+      </w:r>
+      <w:r>
+        <w:t xml:space="preserve">+</w:t>
+      </w:r>
+      <w:r>
+        <w:t xml:space="preserve"> </w:t>
+      </w:r>
+      <w:r>
+        <w:rPr>
+          <w:rStyle w:val="VerbatimChar"/>
+        </w:rPr>
+        <w:t xml:space="preserve">railway.json</w:t>
+      </w:r>
+      <w:r>
+        <w:t xml:space="preserve"> </w:t>
+      </w:r>
+      <w:r>
+        <w:t xml:space="preserve">(Caddy) and</w:t>
+      </w:r>
+      <w:r>
+        <w:t xml:space="preserve"> </w:t>
+      </w:r>
+      <w:r>
+        <w:rPr>
+          <w:rStyle w:val="VerbatimChar"/>
+        </w:rPr>
+        <w:t xml:space="preserve">deploy/Dockerfile.refresh</w:t>
+      </w:r>
+      <w:r>
+        <w:t xml:space="preserve"> </w:t>
+      </w:r>
+      <w:r>
+        <w:t xml:space="preserve">+</w:t>
+      </w:r>
+      <w:r>
+        <w:t xml:space="preserve"> </w:t>
+      </w:r>
+      <w:r>
+        <w:rPr>
+          <w:rStyle w:val="VerbatimChar"/>
+        </w:rPr>
+        <w:t xml:space="preserve">refresh.sh</w:t>
+      </w:r>
+      <w:r>
+        <w:t xml:space="preserve"> </w:t>
+      </w:r>
+      <w:r>
+        <w:t xml:space="preserve">for Railway.</w:t>
       </w:r>
     </w:p>
     <w:p>
@@ -887,59 +1090,47 @@
         <w:pStyle w:val="Compact"/>
       </w:pPr>
       <w:r>
-        <w:t xml:space="preserve">Knox and Williamson show 0 cross-county postal — plausible (Knoxville and Franklin postal areas are</w:t>
-      </w:r>
-      <w:r>
-        <w:t xml:space="preserve"> </w:t>
-      </w:r>
-      <w:r>
-        <w:t xml:space="preserve">home to their counties) but verify on the first roster.</w:t>
-      </w:r>
-    </w:p>
-    <w:p>
-      <w:pPr>
-        <w:numPr>
-          <w:ilvl w:val="0"/>
-          <w:numId w:val="1004"/>
-        </w:numPr>
-        <w:pStyle w:val="Compact"/>
-      </w:pPr>
-      <w:r>
-        <w:t xml:space="preserve">Wilson E5 (DOR file ≠ polygon) is 12,691 — highest in the state relative to size; this is the</w:t>
-      </w:r>
-      <w:r>
-        <w:t xml:space="preserve"> </w:t>
-      </w:r>
-      <w:r>
-        <w:t xml:space="preserve">“</w:t>
-      </w:r>
-      <w:r>
-        <w:t xml:space="preserve">counter-finding in the county’s favour</w:t>
-      </w:r>
-      <w:r>
-        <w:t xml:space="preserve">”</w:t>
-      </w:r>
-      <w:r>
-        <w:t xml:space="preserve"> </w:t>
-      </w:r>
-      <w:r>
-        <w:t xml:space="preserve">already documented for Wilson and should be in the</w:t>
-      </w:r>
-      <w:r>
-        <w:t xml:space="preserve"> </w:t>
-      </w:r>
-      <w:r>
-        <w:t xml:space="preserve">engagement letter.</w:t>
-      </w:r>
-    </w:p>
-    <w:bookmarkEnd w:id="23"/>
-    <w:bookmarkStart w:id="24" w:name="where-everything-lives"/>
+        <w:t xml:space="preserve">Remaining steps are credentialed and Dan’s:</w:t>
+      </w:r>
+      <w:r>
+        <w:t xml:space="preserve"> </w:t>
+      </w:r>
+      <w:r>
+        <w:rPr>
+          <w:rStyle w:val="VerbatimChar"/>
+        </w:rPr>
+        <w:t xml:space="preserve">gh repo create … --push</w:t>
+      </w:r>
+      <w:r>
+        <w:t xml:space="preserve">, Settings → Pages → source</w:t>
+      </w:r>
+      <w:r>
+        <w:t xml:space="preserve"> </w:t>
+      </w:r>
+      <w:r>
+        <w:t xml:space="preserve">GitHub Actions, custom domain, four A records + www CNAME at the registrar. All in</w:t>
+      </w:r>
+      <w:r>
+        <w:t xml:space="preserve"> </w:t>
+      </w:r>
+      <w:r>
+        <w:rPr>
+          <w:rStyle w:val="VerbatimChar"/>
+        </w:rPr>
+        <w:t xml:space="preserve">deploy/DEPLOY.md</w:t>
+      </w:r>
+      <w:r>
+        <w:t xml:space="preserve">.</w:t>
+      </w:r>
+    </w:p>
+    <w:bookmarkEnd w:id="24"/>
+    <w:bookmarkStart w:id="25" w:name="known-gaps"/>
     <w:p>
       <w:pPr>
         <w:pStyle w:val="Heading2"/>
       </w:pPr>
       <w:r>
-        <w:t xml:space="preserve">Where everything lives</w:t>
+        <w:t xml:space="preserve">Known gaps</w:t>
       </w:r>
     </w:p>
     <w:p>
@@ -951,61 +1142,13 @@
         <w:pStyle w:val="Compact"/>
       </w:pPr>
       <w:r>
-        <w:t xml:space="preserve">Code, configs, docs, deliverables (Word/PDF), per-county summaries, bulletins, exception CSVs,</w:t>
-      </w:r>
-      <w:r>
-        <w:t xml:space="preserve"> </w:t>
-      </w:r>
-      <w:r>
-        <w:t xml:space="preserve">seams, and the nine published workbenches are synced to</w:t>
-      </w:r>
-      <w:r>
-        <w:t xml:space="preserve"> </w:t>
-      </w:r>
-      <w:r>
-        <w:rPr>
-          <w:rStyle w:val="VerbatimChar"/>
-        </w:rPr>
-        <w:t xml:space="preserve">~/Downloads/civvix-wilson-situs/</w:t>
-      </w:r>
-      <w:r>
-        <w:t xml:space="preserve"> </w:t>
-      </w:r>
-      <w:r>
-        <w:t xml:space="preserve">on</w:t>
-      </w:r>
-      <w:r>
-        <w:t xml:space="preserve"> </w:t>
-      </w:r>
-      <w:r>
-        <w:t xml:space="preserve">Dan’s Mac (zips in</w:t>
-      </w:r>
-      <w:r>
-        <w:t xml:space="preserve"> </w:t>
-      </w:r>
-      <w:r>
-        <w:rPr>
-          <w:rStyle w:val="VerbatimChar"/>
-        </w:rPr>
-        <w:t xml:space="preserve">_sync/</w:t>
-      </w:r>
-      <w:r>
-        <w:t xml:space="preserve">, already extracted in place). Raw layers are in</w:t>
-      </w:r>
-      <w:r>
-        <w:t xml:space="preserve"> </w:t>
-      </w:r>
-      <w:r>
-        <w:rPr>
-          <w:rStyle w:val="VerbatimChar"/>
-        </w:rPr>
-        <w:t xml:space="preserve">data/raw/</w:t>
-      </w:r>
-      <w:r>
-        <w:t xml:space="preserve"> </w:t>
-      </w:r>
-      <w:r>
-        <w:t xml:space="preserve">there.</w:t>
+        <w:t xml:space="preserve">Low DOR address-range match rates worth a look before selling those counties: Obion 26%,</w:t>
+      </w:r>
+      <w:r>
+        <w:t xml:space="preserve"> </w:t>
+      </w:r>
+      <w:r>
+        <w:t xml:space="preserve">Unicoi 27%, Cocke 36%, McMinn 41%, Marion 51%. Probably street-name conventions in the 911 layer.</w:t>
       </w:r>
     </w:p>
     <w:p>
@@ -1017,46 +1160,13 @@
         <w:pStyle w:val="Compact"/>
       </w:pPr>
       <w:r>
-        <w:t xml:space="preserve">The cloud workspace holds the full warehouse (</w:t>
-      </w:r>
-      <w:r>
-        <w:rPr>
-          <w:rStyle w:val="VerbatimChar"/>
-        </w:rPr>
-        <w:t xml:space="preserve">warehouse/raw/...</w:t>
-      </w:r>
-      <w:r>
-        <w:t xml:space="preserve">) and all 95</w:t>
-      </w:r>
-      <w:r>
-        <w:t xml:space="preserve"> </w:t>
-      </w:r>
-      <w:r>
-        <w:rPr>
-          <w:rStyle w:val="VerbatimChar"/>
-        </w:rPr>
-        <w:t xml:space="preserve">out/&lt;slug&gt;/</w:t>
-      </w:r>
-      <w:r>
-        <w:t xml:space="preserve"> </w:t>
-      </w:r>
-      <w:r>
-        <w:t xml:space="preserve">and</w:t>
-      </w:r>
-      <w:r>
-        <w:t xml:space="preserve"> </w:t>
-      </w:r>
-      <w:r>
-        <w:rPr>
-          <w:rStyle w:val="VerbatimChar"/>
-        </w:rPr>
-        <w:t xml:space="preserve">artifact/&lt;slug&gt;/</w:t>
-      </w:r>
-      <w:r>
-        <w:t xml:space="preserve"> </w:t>
-      </w:r>
-      <w:r>
-        <w:t xml:space="preserve">directories for this session.</w:t>
+        <w:t xml:space="preserve">DeKalb’s 911 layer has no ZIPs; a ZIP-less fallback (unique street+number) now carries it</w:t>
+      </w:r>
+      <w:r>
+        <w:t xml:space="preserve"> </w:t>
+      </w:r>
+      <w:r>
+        <w:t xml:space="preserve">(SST match 0.5% → 82.8%, SOS geocode 5 → 690 of 810).</w:t>
       </w:r>
     </w:p>
     <w:p>
@@ -1068,7 +1178,19 @@
         <w:pStyle w:val="Compact"/>
       </w:pPr>
       <w:r>
-        <w:t xml:space="preserve">Weekly boundary-change watch: scheduled task</w:t>
+        <w:t xml:space="preserve">Knox and Williamson show 0 cross-county postal — plausible but verify on the first roster.</w:t>
+      </w:r>
+    </w:p>
+    <w:p>
+      <w:pPr>
+        <w:numPr>
+          <w:ilvl w:val="0"/>
+          <w:numId w:val="1005"/>
+        </w:numPr>
+        <w:pStyle w:val="Compact"/>
+      </w:pPr>
+      <w:r>
+        <w:t xml:space="preserve">Wilson E5 (DOR file ≠ polygon) is 12,691 — the</w:t>
       </w:r>
       <w:r>
         <w:t xml:space="preserve"> </w:t>
@@ -1077,41 +1199,47 @@
         <w:t xml:space="preserve">“</w:t>
       </w:r>
       <w:r>
-        <w:t xml:space="preserve">Situs boundary-change watch (weekly)</w:t>
+        <w:t xml:space="preserve">counter-finding in the county’s favour</w:t>
       </w:r>
       <w:r>
         <w:t xml:space="preserve">”</w:t>
       </w:r>
       <w:r>
-        <w:t xml:space="preserve">, Mondays</w:t>
-      </w:r>
-      <w:r>
-        <w:t xml:space="preserve"> </w:t>
-      </w:r>
-      <w:r>
-        <w:t xml:space="preserve">13:00 UTC, writes</w:t>
-      </w:r>
-      <w:r>
-        <w:t xml:space="preserve"> </w:t>
-      </w:r>
-      <w:r>
-        <w:rPr>
-          <w:rStyle w:val="VerbatimChar"/>
-        </w:rPr>
-        <w:t xml:space="preserve">claude/situs-watch-state.md</w:t>
-      </w:r>
-      <w:r>
-        <w:t xml:space="preserve">.</w:t>
-      </w:r>
-    </w:p>
-    <w:bookmarkEnd w:id="24"/>
-    <w:bookmarkStart w:id="25" w:name="next"/>
+        <w:t xml:space="preserve">; belongs in</w:t>
+      </w:r>
+      <w:r>
+        <w:t xml:space="preserve"> </w:t>
+      </w:r>
+      <w:r>
+        <w:t xml:space="preserve">the engagement letter.</w:t>
+      </w:r>
+    </w:p>
+    <w:p>
+      <w:pPr>
+        <w:numPr>
+          <w:ilvl w:val="0"/>
+          <w:numId w:val="1005"/>
+        </w:numPr>
+        <w:pStyle w:val="Compact"/>
+      </w:pPr>
+      <w:r>
+        <w:t xml:space="preserve">Published claude.ai copies of the Hamilton, Williamson and Montgomery workbenches still show the</w:t>
+      </w:r>
+      <w:r>
+        <w:t xml:space="preserve"> </w:t>
+      </w:r>
+      <w:r>
+        <w:t xml:space="preserve">pre-SOS-refresh numbers (republish was blocked); the site copies are current.</w:t>
+      </w:r>
+    </w:p>
+    <w:bookmarkEnd w:id="25"/>
+    <w:bookmarkStart w:id="26" w:name="where-everything-lives"/>
     <w:p>
       <w:pPr>
         <w:pStyle w:val="Heading2"/>
       </w:pPr>
       <w:r>
-        <w:t xml:space="preserve">Next</w:t>
+        <w:t xml:space="preserve">Where everything lives</w:t>
       </w:r>
     </w:p>
     <w:p>
@@ -1123,7 +1251,61 @@
         <w:pStyle w:val="Compact"/>
       </w:pPr>
       <w:r>
-        <w:t xml:space="preserve">Wilson meeting (week of 14 Sep): demo the Wilson workbench and the atlas; walk the queue banner.</w:t>
+        <w:t xml:space="preserve">Code, configs, docs, deliverables (Word/PDF), per-county summaries, bulletins, exception CSVs,</w:t>
+      </w:r>
+      <w:r>
+        <w:t xml:space="preserve"> </w:t>
+      </w:r>
+      <w:r>
+        <w:t xml:space="preserve">seams, and the nine published workbenches are synced to</w:t>
+      </w:r>
+      <w:r>
+        <w:t xml:space="preserve"> </w:t>
+      </w:r>
+      <w:r>
+        <w:rPr>
+          <w:rStyle w:val="VerbatimChar"/>
+        </w:rPr>
+        <w:t xml:space="preserve">~/Downloads/civvix-wilson-situs/</w:t>
+      </w:r>
+      <w:r>
+        <w:t xml:space="preserve"> </w:t>
+      </w:r>
+      <w:r>
+        <w:t xml:space="preserve">on</w:t>
+      </w:r>
+      <w:r>
+        <w:t xml:space="preserve"> </w:t>
+      </w:r>
+      <w:r>
+        <w:t xml:space="preserve">Dan’s Mac (zips in</w:t>
+      </w:r>
+      <w:r>
+        <w:t xml:space="preserve"> </w:t>
+      </w:r>
+      <w:r>
+        <w:rPr>
+          <w:rStyle w:val="VerbatimChar"/>
+        </w:rPr>
+        <w:t xml:space="preserve">_sync/</w:t>
+      </w:r>
+      <w:r>
+        <w:t xml:space="preserve">, already extracted in place). Raw layers are in</w:t>
+      </w:r>
+      <w:r>
+        <w:t xml:space="preserve"> </w:t>
+      </w:r>
+      <w:r>
+        <w:rPr>
+          <w:rStyle w:val="VerbatimChar"/>
+        </w:rPr>
+        <w:t xml:space="preserve">data/raw/</w:t>
+      </w:r>
+      <w:r>
+        <w:t xml:space="preserve"> </w:t>
+      </w:r>
+      <w:r>
+        <w:t xml:space="preserve">there.</w:t>
       </w:r>
     </w:p>
     <w:p>
@@ -1135,16 +1317,46 @@
         <w:pStyle w:val="Compact"/>
       </w:pPr>
       <w:r>
-        <w:t xml:space="preserve">Fill the 19 missing SOS files; rerun those counties (</w:t>
-      </w:r>
-      <w:r>
-        <w:rPr>
-          <w:rStyle w:val="VerbatimChar"/>
-        </w:rPr>
-        <w:t xml:space="preserve">python3 run_all.py --skip-ingest --counties …</w:t>
-      </w:r>
-      <w:r>
-        <w:t xml:space="preserve">).</w:t>
+        <w:t xml:space="preserve">The cloud workspace holds the full warehouse (</w:t>
+      </w:r>
+      <w:r>
+        <w:rPr>
+          <w:rStyle w:val="VerbatimChar"/>
+        </w:rPr>
+        <w:t xml:space="preserve">warehouse/raw/...</w:t>
+      </w:r>
+      <w:r>
+        <w:t xml:space="preserve">) and all 95</w:t>
+      </w:r>
+      <w:r>
+        <w:t xml:space="preserve"> </w:t>
+      </w:r>
+      <w:r>
+        <w:rPr>
+          <w:rStyle w:val="VerbatimChar"/>
+        </w:rPr>
+        <w:t xml:space="preserve">out/&lt;slug&gt;/</w:t>
+      </w:r>
+      <w:r>
+        <w:t xml:space="preserve"> </w:t>
+      </w:r>
+      <w:r>
+        <w:t xml:space="preserve">and</w:t>
+      </w:r>
+      <w:r>
+        <w:t xml:space="preserve"> </w:t>
+      </w:r>
+      <w:r>
+        <w:rPr>
+          <w:rStyle w:val="VerbatimChar"/>
+        </w:rPr>
+        <w:t xml:space="preserve">artifact/&lt;slug&gt;/</w:t>
+      </w:r>
+      <w:r>
+        <w:t xml:space="preserve"> </w:t>
+      </w:r>
+      <w:r>
+        <w:t xml:space="preserve">directories for this session.</w:t>
       </w:r>
     </w:p>
     <w:p>
@@ -1156,6 +1368,94 @@
         <w:pStyle w:val="Compact"/>
       </w:pPr>
       <w:r>
+        <w:t xml:space="preserve">Weekly boundary-change watch: scheduled task</w:t>
+      </w:r>
+      <w:r>
+        <w:t xml:space="preserve"> </w:t>
+      </w:r>
+      <w:r>
+        <w:t xml:space="preserve">“</w:t>
+      </w:r>
+      <w:r>
+        <w:t xml:space="preserve">Situs boundary-change watch (weekly)</w:t>
+      </w:r>
+      <w:r>
+        <w:t xml:space="preserve">”</w:t>
+      </w:r>
+      <w:r>
+        <w:t xml:space="preserve">, Mondays</w:t>
+      </w:r>
+      <w:r>
+        <w:t xml:space="preserve"> </w:t>
+      </w:r>
+      <w:r>
+        <w:t xml:space="preserve">13:00 UTC, writes</w:t>
+      </w:r>
+      <w:r>
+        <w:t xml:space="preserve"> </w:t>
+      </w:r>
+      <w:r>
+        <w:rPr>
+          <w:rStyle w:val="VerbatimChar"/>
+        </w:rPr>
+        <w:t xml:space="preserve">claude/situs-watch-state.md</w:t>
+      </w:r>
+      <w:r>
+        <w:t xml:space="preserve">.</w:t>
+      </w:r>
+    </w:p>
+    <w:bookmarkEnd w:id="26"/>
+    <w:bookmarkStart w:id="27" w:name="next"/>
+    <w:p>
+      <w:pPr>
+        <w:pStyle w:val="Heading2"/>
+      </w:pPr>
+      <w:r>
+        <w:t xml:space="preserve">Next</w:t>
+      </w:r>
+    </w:p>
+    <w:p>
+      <w:pPr>
+        <w:numPr>
+          <w:ilvl w:val="0"/>
+          <w:numId w:val="1007"/>
+        </w:numPr>
+        <w:pStyle w:val="Compact"/>
+      </w:pPr>
+      <w:r>
+        <w:t xml:space="preserve">Wilson meeting (week of 14 Sep): demo the Wilson workbench and the atlas; walk the queue banner.</w:t>
+      </w:r>
+    </w:p>
+    <w:p>
+      <w:pPr>
+        <w:numPr>
+          <w:ilvl w:val="0"/>
+          <w:numId w:val="1007"/>
+        </w:numPr>
+        <w:pStyle w:val="Compact"/>
+      </w:pPr>
+      <w:r>
+        <w:t xml:space="preserve">Push the repo and turn on Pages + DNS (</w:t>
+      </w:r>
+      <w:r>
+        <w:rPr>
+          <w:rStyle w:val="VerbatimChar"/>
+        </w:rPr>
+        <w:t xml:space="preserve">deploy/DEPLOY.md</w:t>
+      </w:r>
+      <w:r>
+        <w:t xml:space="preserve">); then the site is the demo link.</w:t>
+      </w:r>
+    </w:p>
+    <w:p>
+      <w:pPr>
+        <w:numPr>
+          <w:ilvl w:val="0"/>
+          <w:numId w:val="1007"/>
+        </w:numPr>
+        <w:pStyle w:val="Compact"/>
+      </w:pPr>
+      <w:r>
         <w:t xml:space="preserve">First roster paste (Wilson) →</w:t>
       </w:r>
       <w:r>
@@ -1178,7 +1478,7 @@
       <w:pPr>
         <w:numPr>
           <w:ilvl w:val="0"/>
-          <w:numId w:val="1006"/>
+          <w:numId w:val="1007"/>
         </w:numPr>
         <w:pStyle w:val="Compact"/>
       </w:pPr>
@@ -1204,8 +1504,8 @@
         <w:t xml:space="preserve">.</w:t>
       </w:r>
     </w:p>
-    <w:bookmarkEnd w:id="25"/>
-    <w:bookmarkEnd w:id="26"/>
+    <w:bookmarkEnd w:id="27"/>
+    <w:bookmarkEnd w:id="28"/>
     <w:sectPr>
       <w:pgSz w:h="15840" w:w="12240"/>
       <w:pgMar w:bottom="1440" w:left="1440" w:right="1440" w:top="1440"/>
@@ -1495,6 +1795,9 @@
     <w:abstractNumId w:val="991"/>
   </w:num>
   <w:num w:numId="1006">
+    <w:abstractNumId w:val="991"/>
+  </w:num>
+  <w:num w:numId="1007">
     <w:abstractNumId w:val="99411"/>
     <w:lvlOverride w:ilvl="0">
       <w:startOverride w:val="1"/>

</xml_diff>